<commit_message>
update link git on document
</commit_message>
<xml_diff>
--- a/524K0008_VuHungPhi.docx
+++ b/524K0008_VuHungPhi.docx
@@ -980,8 +980,6 @@
           <w:fldChar w:fldCharType="end"/>
         </w:r>
       </w:hyperlink>
-      <w:bookmarkStart w:id="0" w:name="_GoBack"/>
-      <w:bookmarkEnd w:id="0"/>
     </w:p>
     <w:p>
       <w:pPr>
@@ -1308,7 +1306,7 @@
           <w:lang w:val="en-US"/>
         </w:rPr>
       </w:pPr>
-      <w:bookmarkStart w:id="1" w:name="_Toc227519547"/>
+      <w:bookmarkStart w:id="0" w:name="_Toc227519547"/>
       <w:r>
         <w:rPr>
           <w:rFonts w:cstheme="majorHAnsi"/>
@@ -1320,7 +1318,7 @@
         </w:rPr>
         <w:t>I. Introduction</w:t>
       </w:r>
-      <w:bookmarkEnd w:id="1"/>
+      <w:bookmarkEnd w:id="0"/>
     </w:p>
     <w:p>
       <w:pPr>
@@ -1375,7 +1373,7 @@
           <w:lang w:val="en-US"/>
         </w:rPr>
       </w:pPr>
-      <w:bookmarkStart w:id="2" w:name="_Toc227519548"/>
+      <w:bookmarkStart w:id="1" w:name="_Toc227519548"/>
       <w:r>
         <w:rPr>
           <w:rFonts w:asciiTheme="majorHAnsi" w:hAnsiTheme="majorHAnsi" w:cstheme="majorHAnsi"/>
@@ -1387,7 +1385,7 @@
         </w:rPr>
         <w:t>II. Exercise</w:t>
       </w:r>
-      <w:bookmarkEnd w:id="2"/>
+      <w:bookmarkEnd w:id="1"/>
     </w:p>
     <w:p>
       <w:pPr>
@@ -1403,7 +1401,7 @@
           <w:lang w:val="en-US"/>
         </w:rPr>
       </w:pPr>
-      <w:bookmarkStart w:id="3" w:name="_Toc227519549"/>
+      <w:bookmarkStart w:id="2" w:name="_Toc227519549"/>
       <w:r>
         <w:rPr>
           <w:rFonts w:asciiTheme="majorHAnsi" w:hAnsiTheme="majorHAnsi" w:cstheme="majorHAnsi"/>
@@ -1415,7 +1413,7 @@
         </w:rPr>
         <w:t>1. Exercise 1</w:t>
       </w:r>
-      <w:bookmarkEnd w:id="3"/>
+      <w:bookmarkEnd w:id="2"/>
     </w:p>
     <w:p>
       <w:pPr>
@@ -1950,7 +1948,7 @@
           <w:lang w:val="en-US"/>
         </w:rPr>
       </w:pPr>
-      <w:bookmarkStart w:id="4" w:name="_Toc227519550"/>
+      <w:bookmarkStart w:id="3" w:name="_Toc227519550"/>
       <w:r>
         <w:rPr>
           <w:rFonts w:asciiTheme="majorHAnsi" w:hAnsiTheme="majorHAnsi" w:cstheme="majorHAnsi"/>
@@ -1961,7 +1959,7 @@
         </w:rPr>
         <w:t>2. Exercise 2</w:t>
       </w:r>
-      <w:bookmarkEnd w:id="4"/>
+      <w:bookmarkEnd w:id="3"/>
     </w:p>
     <w:p>
       <w:pPr>
@@ -2332,7 +2330,7 @@
           <w:lang w:val="en-US"/>
         </w:rPr>
       </w:pPr>
-      <w:bookmarkStart w:id="5" w:name="_Toc227519551"/>
+      <w:bookmarkStart w:id="4" w:name="_Toc227519551"/>
       <w:r>
         <w:rPr>
           <w:rFonts w:asciiTheme="majorHAnsi" w:hAnsiTheme="majorHAnsi" w:cstheme="majorHAnsi"/>
@@ -2343,7 +2341,7 @@
         </w:rPr>
         <w:t>3. Exercise 3</w:t>
       </w:r>
-      <w:bookmarkEnd w:id="5"/>
+      <w:bookmarkEnd w:id="4"/>
     </w:p>
     <w:p>
       <w:pPr>
@@ -2825,7 +2823,7 @@
           <w:lang w:val="en-US"/>
         </w:rPr>
       </w:pPr>
-      <w:bookmarkStart w:id="6" w:name="_Toc227519552"/>
+      <w:bookmarkStart w:id="5" w:name="_Toc227519552"/>
       <w:r>
         <w:rPr>
           <w:rFonts w:asciiTheme="majorHAnsi" w:hAnsiTheme="majorHAnsi" w:cstheme="majorHAnsi"/>
@@ -2836,7 +2834,7 @@
         </w:rPr>
         <w:t>4. Exercise 4</w:t>
       </w:r>
-      <w:bookmarkEnd w:id="6"/>
+      <w:bookmarkEnd w:id="5"/>
     </w:p>
     <w:p>
       <w:pPr>
@@ -3235,7 +3233,7 @@
           <w:lang w:val="en-US"/>
         </w:rPr>
       </w:pPr>
-      <w:bookmarkStart w:id="7" w:name="_Toc227519553"/>
+      <w:bookmarkStart w:id="6" w:name="_Toc227519553"/>
       <w:r>
         <w:rPr>
           <w:rFonts w:cstheme="majorHAnsi"/>
@@ -3247,7 +3245,7 @@
         </w:rPr>
         <w:t>III. Screenshots</w:t>
       </w:r>
-      <w:bookmarkEnd w:id="7"/>
+      <w:bookmarkEnd w:id="6"/>
     </w:p>
     <w:p>
       <w:pPr>
@@ -3261,7 +3259,7 @@
           <w:lang w:val="en-US"/>
         </w:rPr>
       </w:pPr>
-      <w:bookmarkStart w:id="8" w:name="_Toc227519554"/>
+      <w:bookmarkStart w:id="7" w:name="_Toc227519554"/>
       <w:r>
         <w:rPr>
           <w:rFonts w:asciiTheme="majorHAnsi" w:hAnsiTheme="majorHAnsi" w:cstheme="majorHAnsi"/>
@@ -3302,7 +3300,7 @@
         </w:rPr>
         <w:t>1</w:t>
       </w:r>
-      <w:bookmarkEnd w:id="8"/>
+      <w:bookmarkEnd w:id="7"/>
     </w:p>
     <w:p>
       <w:pPr>
@@ -3626,7 +3624,7 @@
           <w:lang w:val="en-US"/>
         </w:rPr>
       </w:pPr>
-      <w:bookmarkStart w:id="9" w:name="_Toc227519555"/>
+      <w:bookmarkStart w:id="8" w:name="_Toc227519555"/>
       <w:r>
         <w:rPr>
           <w:rFonts w:asciiTheme="majorHAnsi" w:hAnsiTheme="majorHAnsi" w:cstheme="majorHAnsi"/>
@@ -3667,7 +3665,7 @@
         </w:rPr>
         <w:t>2</w:t>
       </w:r>
-      <w:bookmarkEnd w:id="9"/>
+      <w:bookmarkEnd w:id="8"/>
     </w:p>
     <w:p>
       <w:pPr>
@@ -3703,10 +3701,11 @@
       <w:r>
         <w:rPr>
           <w:rFonts w:asciiTheme="majorHAnsi" w:hAnsiTheme="majorHAnsi" w:cstheme="majorHAnsi"/>
-          <w:color w:val="000000" w:themeColor="text1"/>
-          <w:sz w:val="26"/>
-          <w:szCs w:val="26"/>
-          <w:lang w:val="en-US"/>
+          <w:noProof/>
+          <w:color w:val="000000" w:themeColor="text1"/>
+          <w:sz w:val="26"/>
+          <w:szCs w:val="26"/>
+          <w:lang w:eastAsia="vi-VN"/>
         </w:rPr>
         <w:lastRenderedPageBreak/>
         <w:drawing>
@@ -3780,10 +3779,11 @@
       <w:r>
         <w:rPr>
           <w:rFonts w:asciiTheme="majorHAnsi" w:hAnsiTheme="majorHAnsi" w:cstheme="majorHAnsi"/>
-          <w:color w:val="000000" w:themeColor="text1"/>
-          <w:sz w:val="26"/>
-          <w:szCs w:val="26"/>
-          <w:lang w:val="en-US"/>
+          <w:noProof/>
+          <w:color w:val="000000" w:themeColor="text1"/>
+          <w:sz w:val="26"/>
+          <w:szCs w:val="26"/>
+          <w:lang w:eastAsia="vi-VN"/>
         </w:rPr>
         <w:drawing>
           <wp:inline distT="0" distB="0" distL="0" distR="0" wp14:anchorId="522D02DA" wp14:editId="321671F3">
@@ -3856,10 +3856,11 @@
       <w:r>
         <w:rPr>
           <w:rFonts w:asciiTheme="majorHAnsi" w:hAnsiTheme="majorHAnsi" w:cstheme="majorHAnsi"/>
-          <w:color w:val="000000" w:themeColor="text1"/>
-          <w:sz w:val="26"/>
-          <w:szCs w:val="26"/>
-          <w:lang w:val="en-US"/>
+          <w:noProof/>
+          <w:color w:val="000000" w:themeColor="text1"/>
+          <w:sz w:val="26"/>
+          <w:szCs w:val="26"/>
+          <w:lang w:eastAsia="vi-VN"/>
         </w:rPr>
         <w:lastRenderedPageBreak/>
         <w:drawing>
@@ -3911,7 +3912,7 @@
           <w:lang w:val="en-US"/>
         </w:rPr>
       </w:pPr>
-      <w:bookmarkStart w:id="10" w:name="_Toc227519556"/>
+      <w:bookmarkStart w:id="9" w:name="_Toc227519556"/>
       <w:r>
         <w:rPr>
           <w:rFonts w:asciiTheme="majorHAnsi" w:hAnsiTheme="majorHAnsi" w:cstheme="majorHAnsi"/>
@@ -3952,7 +3953,7 @@
         </w:rPr>
         <w:t>3</w:t>
       </w:r>
-      <w:bookmarkEnd w:id="10"/>
+      <w:bookmarkEnd w:id="9"/>
     </w:p>
     <w:p>
       <w:pPr>
@@ -3988,10 +3989,11 @@
       <w:r>
         <w:rPr>
           <w:rFonts w:asciiTheme="majorHAnsi" w:hAnsiTheme="majorHAnsi" w:cstheme="majorHAnsi"/>
-          <w:color w:val="000000" w:themeColor="text1"/>
-          <w:sz w:val="26"/>
-          <w:szCs w:val="26"/>
-          <w:lang w:val="en-US"/>
+          <w:noProof/>
+          <w:color w:val="000000" w:themeColor="text1"/>
+          <w:sz w:val="26"/>
+          <w:szCs w:val="26"/>
+          <w:lang w:eastAsia="vi-VN"/>
         </w:rPr>
         <w:drawing>
           <wp:inline distT="0" distB="0" distL="0" distR="0" wp14:anchorId="5DE7C46D" wp14:editId="6215A321">
@@ -4064,10 +4066,11 @@
       <w:r>
         <w:rPr>
           <w:rFonts w:asciiTheme="majorHAnsi" w:hAnsiTheme="majorHAnsi" w:cstheme="majorHAnsi"/>
-          <w:color w:val="000000" w:themeColor="text1"/>
-          <w:sz w:val="26"/>
-          <w:szCs w:val="26"/>
-          <w:lang w:val="en-US"/>
+          <w:noProof/>
+          <w:color w:val="000000" w:themeColor="text1"/>
+          <w:sz w:val="26"/>
+          <w:szCs w:val="26"/>
+          <w:lang w:eastAsia="vi-VN"/>
         </w:rPr>
         <w:lastRenderedPageBreak/>
         <w:drawing>
@@ -4120,10 +4123,11 @@
       <w:r>
         <w:rPr>
           <w:rFonts w:asciiTheme="majorHAnsi" w:hAnsiTheme="majorHAnsi" w:cstheme="majorHAnsi"/>
-          <w:color w:val="000000" w:themeColor="text1"/>
-          <w:sz w:val="26"/>
-          <w:szCs w:val="26"/>
-          <w:lang w:val="en-US"/>
+          <w:noProof/>
+          <w:color w:val="000000" w:themeColor="text1"/>
+          <w:sz w:val="26"/>
+          <w:szCs w:val="26"/>
+          <w:lang w:eastAsia="vi-VN"/>
         </w:rPr>
         <w:drawing>
           <wp:inline distT="0" distB="0" distL="0" distR="0" wp14:anchorId="30DD5C25" wp14:editId="656A3F63">
@@ -4175,10 +4179,11 @@
       <w:r>
         <w:rPr>
           <w:rFonts w:asciiTheme="majorHAnsi" w:hAnsiTheme="majorHAnsi" w:cstheme="majorHAnsi"/>
-          <w:color w:val="000000" w:themeColor="text1"/>
-          <w:sz w:val="26"/>
-          <w:szCs w:val="26"/>
-          <w:lang w:val="en-US"/>
+          <w:noProof/>
+          <w:color w:val="000000" w:themeColor="text1"/>
+          <w:sz w:val="26"/>
+          <w:szCs w:val="26"/>
+          <w:lang w:eastAsia="vi-VN"/>
         </w:rPr>
         <w:lastRenderedPageBreak/>
         <w:drawing>
@@ -4252,10 +4257,11 @@
       <w:r>
         <w:rPr>
           <w:rFonts w:asciiTheme="majorHAnsi" w:hAnsiTheme="majorHAnsi" w:cstheme="majorHAnsi"/>
-          <w:color w:val="000000" w:themeColor="text1"/>
-          <w:sz w:val="26"/>
-          <w:szCs w:val="26"/>
-          <w:lang w:val="en-US"/>
+          <w:noProof/>
+          <w:color w:val="000000" w:themeColor="text1"/>
+          <w:sz w:val="26"/>
+          <w:szCs w:val="26"/>
+          <w:lang w:eastAsia="vi-VN"/>
         </w:rPr>
         <w:drawing>
           <wp:inline distT="0" distB="0" distL="0" distR="0" wp14:anchorId="12FF5867" wp14:editId="715C8E9B">
@@ -4306,7 +4312,7 @@
           <w:lang w:val="en-US"/>
         </w:rPr>
       </w:pPr>
-      <w:bookmarkStart w:id="11" w:name="_Toc227519557"/>
+      <w:bookmarkStart w:id="10" w:name="_Toc227519557"/>
       <w:r>
         <w:rPr>
           <w:rFonts w:asciiTheme="majorHAnsi" w:hAnsiTheme="majorHAnsi" w:cstheme="majorHAnsi"/>
@@ -4347,7 +4353,7 @@
         </w:rPr>
         <w:t>4</w:t>
       </w:r>
-      <w:bookmarkEnd w:id="11"/>
+      <w:bookmarkEnd w:id="10"/>
     </w:p>
     <w:p>
       <w:pPr>
@@ -4383,10 +4389,11 @@
       <w:r>
         <w:rPr>
           <w:rFonts w:asciiTheme="majorHAnsi" w:hAnsiTheme="majorHAnsi" w:cstheme="majorHAnsi"/>
-          <w:color w:val="000000" w:themeColor="text1"/>
-          <w:sz w:val="26"/>
-          <w:szCs w:val="26"/>
-          <w:lang w:val="en-US"/>
+          <w:noProof/>
+          <w:color w:val="000000" w:themeColor="text1"/>
+          <w:sz w:val="26"/>
+          <w:szCs w:val="26"/>
+          <w:lang w:eastAsia="vi-VN"/>
         </w:rPr>
         <w:lastRenderedPageBreak/>
         <w:drawing>
@@ -4460,10 +4467,11 @@
       <w:r>
         <w:rPr>
           <w:rFonts w:asciiTheme="majorHAnsi" w:hAnsiTheme="majorHAnsi" w:cstheme="majorHAnsi"/>
-          <w:color w:val="000000" w:themeColor="text1"/>
-          <w:sz w:val="26"/>
-          <w:szCs w:val="26"/>
-          <w:lang w:val="en-US"/>
+          <w:noProof/>
+          <w:color w:val="000000" w:themeColor="text1"/>
+          <w:sz w:val="26"/>
+          <w:szCs w:val="26"/>
+          <w:lang w:eastAsia="vi-VN"/>
         </w:rPr>
         <w:drawing>
           <wp:inline distT="0" distB="0" distL="0" distR="0" wp14:anchorId="595E0299" wp14:editId="2677901D">
@@ -4536,10 +4544,11 @@
       <w:r>
         <w:rPr>
           <w:rFonts w:asciiTheme="majorHAnsi" w:hAnsiTheme="majorHAnsi" w:cstheme="majorHAnsi"/>
-          <w:color w:val="000000" w:themeColor="text1"/>
-          <w:sz w:val="26"/>
-          <w:szCs w:val="26"/>
-          <w:lang w:val="en-US"/>
+          <w:noProof/>
+          <w:color w:val="000000" w:themeColor="text1"/>
+          <w:sz w:val="26"/>
+          <w:szCs w:val="26"/>
+          <w:lang w:eastAsia="vi-VN"/>
         </w:rPr>
         <w:lastRenderedPageBreak/>
         <w:drawing>
@@ -4613,10 +4622,11 @@
       <w:r>
         <w:rPr>
           <w:rFonts w:asciiTheme="majorHAnsi" w:hAnsiTheme="majorHAnsi" w:cstheme="majorHAnsi"/>
-          <w:color w:val="000000" w:themeColor="text1"/>
-          <w:sz w:val="26"/>
-          <w:szCs w:val="26"/>
-          <w:lang w:val="en-US"/>
+          <w:noProof/>
+          <w:color w:val="000000" w:themeColor="text1"/>
+          <w:sz w:val="26"/>
+          <w:szCs w:val="26"/>
+          <w:lang w:eastAsia="vi-VN"/>
         </w:rPr>
         <w:drawing>
           <wp:inline distT="0" distB="0" distL="0" distR="0" wp14:anchorId="0F47150B" wp14:editId="42EFE0B3">
@@ -4689,10 +4699,11 @@
       <w:r>
         <w:rPr>
           <w:rFonts w:asciiTheme="majorHAnsi" w:hAnsiTheme="majorHAnsi" w:cstheme="majorHAnsi"/>
-          <w:color w:val="000000" w:themeColor="text1"/>
-          <w:sz w:val="26"/>
-          <w:szCs w:val="26"/>
-          <w:lang w:val="en-US"/>
+          <w:noProof/>
+          <w:color w:val="000000" w:themeColor="text1"/>
+          <w:sz w:val="26"/>
+          <w:szCs w:val="26"/>
+          <w:lang w:eastAsia="vi-VN"/>
         </w:rPr>
         <w:lastRenderedPageBreak/>
         <w:drawing>
@@ -4744,7 +4755,7 @@
           <w:lang w:val="en-US"/>
         </w:rPr>
       </w:pPr>
-      <w:bookmarkStart w:id="12" w:name="_Toc227519558"/>
+      <w:bookmarkStart w:id="11" w:name="_Toc227519558"/>
       <w:r>
         <w:rPr>
           <w:rFonts w:cstheme="majorHAnsi"/>
@@ -4756,7 +4767,7 @@
         </w:rPr>
         <w:t>IV. Conclusion</w:t>
       </w:r>
-      <w:bookmarkEnd w:id="12"/>
+      <w:bookmarkEnd w:id="11"/>
     </w:p>
     <w:p>
       <w:pPr>
@@ -4826,55 +4837,75 @@
     </w:p>
     <w:p>
       <w:pPr>
-        <w:rPr>
-          <w:rFonts w:asciiTheme="majorHAnsi" w:hAnsiTheme="majorHAnsi" w:cstheme="majorHAnsi"/>
-          <w:color w:val="000000" w:themeColor="text1"/>
-          <w:sz w:val="26"/>
-          <w:szCs w:val="26"/>
-        </w:rPr>
-      </w:pPr>
-    </w:p>
-    <w:p>
-      <w:pPr>
-        <w:rPr>
-          <w:rFonts w:asciiTheme="majorHAnsi" w:hAnsiTheme="majorHAnsi" w:cstheme="majorHAnsi"/>
-          <w:color w:val="000000" w:themeColor="text1"/>
-          <w:sz w:val="26"/>
-          <w:szCs w:val="26"/>
-          <w:lang w:val="en-US"/>
-        </w:rPr>
-      </w:pPr>
-    </w:p>
-    <w:p>
-      <w:pPr>
-        <w:rPr>
-          <w:rFonts w:asciiTheme="majorHAnsi" w:hAnsiTheme="majorHAnsi" w:cstheme="majorHAnsi"/>
-          <w:color w:val="000000" w:themeColor="text1"/>
-          <w:sz w:val="26"/>
-          <w:szCs w:val="26"/>
-          <w:lang w:val="en-US"/>
-        </w:rPr>
-      </w:pPr>
-    </w:p>
-    <w:p>
-      <w:pPr>
-        <w:rPr>
-          <w:rFonts w:asciiTheme="majorHAnsi" w:hAnsiTheme="majorHAnsi" w:cstheme="majorHAnsi"/>
-          <w:color w:val="000000" w:themeColor="text1"/>
-          <w:sz w:val="26"/>
-          <w:szCs w:val="26"/>
-          <w:lang w:val="en-US"/>
-        </w:rPr>
-      </w:pPr>
-    </w:p>
-    <w:p>
-      <w:pPr>
-        <w:rPr>
-          <w:rFonts w:asciiTheme="majorHAnsi" w:hAnsiTheme="majorHAnsi" w:cstheme="majorHAnsi"/>
-          <w:color w:val="000000" w:themeColor="text1"/>
-          <w:sz w:val="26"/>
-          <w:szCs w:val="26"/>
-          <w:lang w:val="en-US"/>
+        <w:spacing w:before="100" w:beforeAutospacing="1" w:after="100" w:afterAutospacing="1" w:line="240" w:lineRule="auto"/>
+        <w:rPr>
+          <w:rFonts w:ascii="Times New Roman" w:eastAsia="Times New Roman" w:hAnsi="Times New Roman" w:cs="Times New Roman"/>
+          <w:color w:val="000000" w:themeColor="text1"/>
+          <w:sz w:val="24"/>
+          <w:szCs w:val="24"/>
+          <w:lang w:eastAsia="vi-VN"/>
+        </w:rPr>
+      </w:pPr>
+      <w:r>
+        <w:rPr>
+          <w:rFonts w:ascii="Times New Roman" w:eastAsia="Times New Roman" w:hAnsi="Times New Roman" w:cs="Times New Roman"/>
+          <w:color w:val="000000" w:themeColor="text1"/>
+          <w:sz w:val="24"/>
+          <w:szCs w:val="24"/>
+          <w:lang w:eastAsia="vi-VN"/>
+        </w:rPr>
+        <w:t>https://github.com/xiongfei2011/Lab09_524K0008</w:t>
+      </w:r>
+      <w:bookmarkStart w:id="12" w:name="_GoBack"/>
+      <w:bookmarkEnd w:id="12"/>
+    </w:p>
+    <w:p>
+      <w:pPr>
+        <w:rPr>
+          <w:rFonts w:asciiTheme="majorHAnsi" w:hAnsiTheme="majorHAnsi" w:cstheme="majorHAnsi"/>
+          <w:color w:val="000000" w:themeColor="text1"/>
+          <w:sz w:val="26"/>
+          <w:szCs w:val="26"/>
+        </w:rPr>
+      </w:pPr>
+    </w:p>
+    <w:p>
+      <w:pPr>
+        <w:rPr>
+          <w:rFonts w:asciiTheme="majorHAnsi" w:hAnsiTheme="majorHAnsi" w:cstheme="majorHAnsi"/>
+          <w:color w:val="000000" w:themeColor="text1"/>
+          <w:sz w:val="26"/>
+          <w:szCs w:val="26"/>
+        </w:rPr>
+      </w:pPr>
+    </w:p>
+    <w:p>
+      <w:pPr>
+        <w:rPr>
+          <w:rFonts w:asciiTheme="majorHAnsi" w:hAnsiTheme="majorHAnsi" w:cstheme="majorHAnsi"/>
+          <w:color w:val="000000" w:themeColor="text1"/>
+          <w:sz w:val="26"/>
+          <w:szCs w:val="26"/>
+        </w:rPr>
+      </w:pPr>
+    </w:p>
+    <w:p>
+      <w:pPr>
+        <w:rPr>
+          <w:rFonts w:asciiTheme="majorHAnsi" w:hAnsiTheme="majorHAnsi" w:cstheme="majorHAnsi"/>
+          <w:color w:val="000000" w:themeColor="text1"/>
+          <w:sz w:val="26"/>
+          <w:szCs w:val="26"/>
+        </w:rPr>
+      </w:pPr>
+    </w:p>
+    <w:p>
+      <w:pPr>
+        <w:rPr>
+          <w:rFonts w:asciiTheme="majorHAnsi" w:hAnsiTheme="majorHAnsi" w:cstheme="majorHAnsi"/>
+          <w:color w:val="000000" w:themeColor="text1"/>
+          <w:sz w:val="26"/>
+          <w:szCs w:val="26"/>
         </w:rPr>
       </w:pPr>
     </w:p>
@@ -6835,7 +6866,7 @@
 </file>
 
 <file path=customXml/itemProps1.xml><?xml version="1.0" encoding="utf-8"?>
-<ds:datastoreItem xmlns:ds="http://schemas.openxmlformats.org/officeDocument/2006/customXml" ds:itemID="{B215CC49-FF2C-416B-8587-49AA62BE3E3D}">
+<ds:datastoreItem xmlns:ds="http://schemas.openxmlformats.org/officeDocument/2006/customXml" ds:itemID="{07085CDC-09DD-46EE-8486-CAF29103C48F}">
   <ds:schemaRefs>
     <ds:schemaRef ds:uri="http://schemas.openxmlformats.org/officeDocument/2006/bibliography"/>
   </ds:schemaRefs>

</xml_diff>